<commit_message>
docs: actualizar README y manuales con guia de configuracion de TV y HDMI-CEC
</commit_message>
<xml_diff>
--- a/docs/MANUAL_PRODUCTO_MYPLAYAD.docx
+++ b/docs/MANUAL_PRODUCTO_MYPLAYAD.docx
@@ -3896,7 +3896,361 @@
           <w:color w:val="1E293B"/>
           <w:sz w:val="21"/>
         </w:rPr>
-        <w:t>Para maximizar la vida útil del display y minimizar el consumo de energía en horas no laborales, el sistema incorpora un motor inteligente de programación diaria de encendido y apagado:</w:t>
+        <w:t>Para maximizar la vida útil del display y minimizar el consumo de energía en horas no laborales, el sistema incorpora un motor inteligente de encendido automático por hardware y programación diaria de energía:</w:t>
+      </w:r>
+    </w:p>
+    <w:p>
+      <w:pPr>
+        <w:spacing w:before="240" w:after="60"/>
+      </w:pPr>
+      <w:r>
+        <w:rPr>
+          <w:rFonts w:ascii="Calibri" w:hAnsi="Calibri"/>
+          <w:b/>
+          <w:color w:val="0369A1"/>
+          <w:sz w:val="24"/>
+        </w:rPr>
+        <w:t>8.1. Encendido Automático Inmediato al Encender la Raspberry Pi 5 (Boot-time CEC)</w:t>
+      </w:r>
+    </w:p>
+    <w:p>
+      <w:pPr>
+        <w:spacing w:before="40" w:after="100" w:line="276" w:lineRule="auto"/>
+      </w:pPr>
+      <w:r>
+        <w:rPr>
+          <w:rFonts w:ascii="Calibri" w:hAnsi="Calibri"/>
+          <w:color w:val="1E293B"/>
+          <w:sz w:val="21"/>
+        </w:rPr>
+        <w:t xml:space="preserve">Los televisores comerciales y residenciales no se encienden solo con la presencia de señal eléctrica HDMI; por normativas internacionales de consumo eléctrico permanecen en Standby a menos que reciban una orden de encendido activa. MyPlayAd implementa una arquitectura de encendido en 4 capas para que </w:t>
+      </w:r>
+      <w:r>
+        <w:rPr>
+          <w:rFonts w:ascii="Calibri" w:hAnsi="Calibri"/>
+          <w:b/>
+          <w:color w:val="1E293B"/>
+          <w:sz w:val="21"/>
+        </w:rPr>
+        <w:t>el televisor se encienda de forma instantánea y seleccione la entrada HDMI correcta en cuanto la Raspberry Pi recibe energía</w:t>
+      </w:r>
+      <w:r>
+        <w:rPr>
+          <w:rFonts w:ascii="Calibri" w:hAnsi="Calibri"/>
+          <w:color w:val="1E293B"/>
+          <w:sz w:val="21"/>
+        </w:rPr>
+        <w:t>:</w:t>
+      </w:r>
+    </w:p>
+    <w:p>
+      <w:pPr>
+        <w:pStyle w:val="ListNumber"/>
+        <w:spacing w:before="20" w:after="40"/>
+        <w:ind w:left="360"/>
+      </w:pPr>
+      <w:r>
+        <w:rPr>
+          <w:rFonts w:ascii="Calibri" w:hAnsi="Calibri"/>
+          <w:b/>
+          <w:color w:val="1E293B"/>
+          <w:sz w:val="20"/>
+        </w:rPr>
+        <w:t>Arranque Temprano del Sistema Operativo (`systemd`):</w:t>
+      </w:r>
+      <w:r>
+        <w:rPr>
+          <w:rFonts w:ascii="Calibri" w:hAnsi="Calibri"/>
+          <w:color w:val="1E293B"/>
+          <w:sz w:val="20"/>
+        </w:rPr>
+        <w:t xml:space="preserve"> El servicio </w:t>
+      </w:r>
+      <w:r>
+        <w:rPr>
+          <w:rFonts w:ascii="Consolas" w:hAnsi="Consolas"/>
+          <w:color w:val="0284C7"/>
+          <w:sz w:val="18"/>
+        </w:rPr>
+        <w:t>myplayad-tv-poweron.service</w:t>
+      </w:r>
+      <w:r>
+        <w:rPr>
+          <w:rFonts w:ascii="Calibri" w:hAnsi="Calibri"/>
+          <w:color w:val="1E293B"/>
+          <w:sz w:val="20"/>
+        </w:rPr>
+        <w:t xml:space="preserve"> se ejecuta al alcanzar </w:t>
+      </w:r>
+      <w:r>
+        <w:rPr>
+          <w:rFonts w:ascii="Consolas" w:hAnsi="Consolas"/>
+          <w:color w:val="0284C7"/>
+          <w:sz w:val="18"/>
+        </w:rPr>
+        <w:t>multi-user.target</w:t>
+      </w:r>
+      <w:r>
+        <w:rPr>
+          <w:rFonts w:ascii="Calibri" w:hAnsi="Calibri"/>
+          <w:color w:val="1E293B"/>
+          <w:sz w:val="20"/>
+        </w:rPr>
+        <w:t xml:space="preserve"> enviando inmediatamente los frames HDMI-CEC </w:t>
+      </w:r>
+      <w:r>
+        <w:rPr>
+          <w:rFonts w:ascii="Consolas" w:hAnsi="Consolas"/>
+          <w:color w:val="0284C7"/>
+          <w:sz w:val="18"/>
+        </w:rPr>
+        <w:t>(echo "on 0"; echo "tx 10:04"; sleep 1; echo "as") | cec-client -s -d 1</w:t>
+      </w:r>
+      <w:r>
+        <w:rPr>
+          <w:rFonts w:ascii="Calibri" w:hAnsi="Calibri"/>
+          <w:color w:val="1E293B"/>
+          <w:sz w:val="20"/>
+        </w:rPr>
+        <w:t>. Esto permite que el televisor despierte y precaliente su panel mientras cargan los servicios gráficos.</w:t>
+      </w:r>
+    </w:p>
+    <w:p>
+      <w:pPr>
+        <w:pStyle w:val="ListNumber"/>
+        <w:spacing w:before="20" w:after="40"/>
+        <w:ind w:left="360"/>
+      </w:pPr>
+      <w:r>
+        <w:rPr>
+          <w:rFonts w:ascii="Calibri" w:hAnsi="Calibri"/>
+          <w:b/>
+          <w:color w:val="1E293B"/>
+          <w:sz w:val="20"/>
+        </w:rPr>
+        <w:t>Activación de Tubería Wayland (`labwc/autostart`):</w:t>
+      </w:r>
+      <w:r>
+        <w:rPr>
+          <w:rFonts w:ascii="Calibri" w:hAnsi="Calibri"/>
+          <w:color w:val="1E293B"/>
+          <w:sz w:val="20"/>
+        </w:rPr>
+        <w:t xml:space="preserve"> Al iniciar la sesión gráfica, el compositor ejecuta </w:t>
+      </w:r>
+      <w:r>
+        <w:rPr>
+          <w:rFonts w:ascii="Consolas" w:hAnsi="Consolas"/>
+          <w:color w:val="0284C7"/>
+          <w:sz w:val="18"/>
+        </w:rPr>
+        <w:t>power.sh on &amp;</w:t>
+      </w:r>
+      <w:r>
+        <w:rPr>
+          <w:rFonts w:ascii="Calibri" w:hAnsi="Calibri"/>
+          <w:color w:val="1E293B"/>
+          <w:sz w:val="20"/>
+        </w:rPr>
+        <w:t>, asegurando la activación del puerto de video (</w:t>
+      </w:r>
+      <w:r>
+        <w:rPr>
+          <w:rFonts w:ascii="Consolas" w:hAnsi="Consolas"/>
+          <w:color w:val="0284C7"/>
+          <w:sz w:val="18"/>
+        </w:rPr>
+        <w:t>wlr-randr --output HDMI-A-1 --on --transform $SCREEN_ROTATE</w:t>
+      </w:r>
+      <w:r>
+        <w:rPr>
+          <w:rFonts w:ascii="Calibri" w:hAnsi="Calibri"/>
+          <w:color w:val="1E293B"/>
+          <w:sz w:val="20"/>
+        </w:rPr>
+        <w:t>).</w:t>
+      </w:r>
+    </w:p>
+    <w:p>
+      <w:pPr>
+        <w:pStyle w:val="ListNumber"/>
+        <w:spacing w:before="20" w:after="40"/>
+        <w:ind w:left="360"/>
+      </w:pPr>
+      <w:r>
+        <w:rPr>
+          <w:rFonts w:ascii="Calibri" w:hAnsi="Calibri"/>
+          <w:b/>
+          <w:color w:val="1E293B"/>
+          <w:sz w:val="20"/>
+        </w:rPr>
+        <w:t>Servidor Local Node.js (`server.js`):</w:t>
+      </w:r>
+      <w:r>
+        <w:rPr>
+          <w:rFonts w:ascii="Calibri" w:hAnsi="Calibri"/>
+          <w:color w:val="1E293B"/>
+          <w:sz w:val="20"/>
+        </w:rPr>
+        <w:t xml:space="preserve"> Al levantar el servidor HTTP local (:8090), confirma la orden de encendido vía script para certificar disponibilidad de pantalla.</w:t>
+      </w:r>
+    </w:p>
+    <w:p>
+      <w:pPr>
+        <w:pStyle w:val="ListNumber"/>
+        <w:spacing w:before="20" w:after="40"/>
+        <w:ind w:left="360"/>
+      </w:pPr>
+      <w:r>
+        <w:rPr>
+          <w:rFonts w:ascii="Calibri" w:hAnsi="Calibri"/>
+          <w:b/>
+          <w:color w:val="1E293B"/>
+          <w:sz w:val="20"/>
+        </w:rPr>
+        <w:t>Firmware HDMI Hotplug Forzado (`/boot/firmware/config.txt`):</w:t>
+      </w:r>
+      <w:r>
+        <w:rPr>
+          <w:rFonts w:ascii="Calibri" w:hAnsi="Calibri"/>
+          <w:color w:val="1E293B"/>
+          <w:sz w:val="20"/>
+        </w:rPr>
+        <w:t xml:space="preserve"> Con las directivas </w:t>
+      </w:r>
+      <w:r>
+        <w:rPr>
+          <w:rFonts w:ascii="Consolas" w:hAnsi="Consolas"/>
+          <w:color w:val="0284C7"/>
+          <w:sz w:val="18"/>
+        </w:rPr>
+        <w:t>hdmi_force_hotplug=1</w:t>
+      </w:r>
+      <w:r>
+        <w:rPr>
+          <w:rFonts w:ascii="Calibri" w:hAnsi="Calibri"/>
+          <w:color w:val="1E293B"/>
+          <w:sz w:val="20"/>
+        </w:rPr>
+        <w:t xml:space="preserve">, </w:t>
+      </w:r>
+      <w:r>
+        <w:rPr>
+          <w:rFonts w:ascii="Consolas" w:hAnsi="Consolas"/>
+          <w:color w:val="0284C7"/>
+          <w:sz w:val="18"/>
+        </w:rPr>
+        <w:t>hdmi_force_hotplug:0=1</w:t>
+      </w:r>
+      <w:r>
+        <w:rPr>
+          <w:rFonts w:ascii="Calibri" w:hAnsi="Calibri"/>
+          <w:color w:val="1E293B"/>
+          <w:sz w:val="20"/>
+        </w:rPr>
+        <w:t xml:space="preserve"> y </w:t>
+      </w:r>
+      <w:r>
+        <w:rPr>
+          <w:rFonts w:ascii="Consolas" w:hAnsi="Consolas"/>
+          <w:color w:val="0284C7"/>
+          <w:sz w:val="18"/>
+        </w:rPr>
+        <w:t>cec_osd_name=MyPlayAd</w:t>
+      </w:r>
+      <w:r>
+        <w:rPr>
+          <w:rFonts w:ascii="Calibri" w:hAnsi="Calibri"/>
+          <w:color w:val="1E293B"/>
+          <w:sz w:val="20"/>
+        </w:rPr>
+        <w:t>, la Raspberry Pi nunca corta el reloj HDMI aunque el televisor esté apagado al momento de conectar la consola.</w:t>
+      </w:r>
+    </w:p>
+    <w:p>
+      <w:pPr>
+        <w:pStyle w:val="ListNumber"/>
+        <w:spacing w:before="20" w:after="40"/>
+        <w:ind w:left="360"/>
+      </w:pPr>
+      <w:r>
+        <w:rPr>
+          <w:rFonts w:ascii="Calibri" w:hAnsi="Calibri"/>
+          <w:b/>
+          <w:color w:val="1E293B"/>
+          <w:sz w:val="20"/>
+        </w:rPr>
+        <w:t>Doble Puerto Micro-HDMI y Refuerzo de 3 Segundos:</w:t>
+      </w:r>
+      <w:r>
+        <w:rPr>
+          <w:rFonts w:ascii="Calibri" w:hAnsi="Calibri"/>
+          <w:color w:val="1E293B"/>
+          <w:sz w:val="20"/>
+        </w:rPr>
+        <w:t xml:space="preserve"> Se emite la señal a ambos puertos de la RPi 5 (</w:t>
+      </w:r>
+      <w:r>
+        <w:rPr>
+          <w:rFonts w:ascii="Consolas" w:hAnsi="Consolas"/>
+          <w:color w:val="0284C7"/>
+          <w:sz w:val="18"/>
+        </w:rPr>
+        <w:t>/dev/cec0</w:t>
+      </w:r>
+      <w:r>
+        <w:rPr>
+          <w:rFonts w:ascii="Calibri" w:hAnsi="Calibri"/>
+          <w:color w:val="1E293B"/>
+          <w:sz w:val="20"/>
+        </w:rPr>
+        <w:t xml:space="preserve"> y </w:t>
+      </w:r>
+      <w:r>
+        <w:rPr>
+          <w:rFonts w:ascii="Consolas" w:hAnsi="Consolas"/>
+          <w:color w:val="0284C7"/>
+          <w:sz w:val="18"/>
+        </w:rPr>
+        <w:t>/dev/cec1</w:t>
+      </w:r>
+      <w:r>
+        <w:rPr>
+          <w:rFonts w:ascii="Calibri" w:hAnsi="Calibri"/>
+          <w:color w:val="1E293B"/>
+          <w:sz w:val="20"/>
+        </w:rPr>
+        <w:t>) y se despacha un refuerzo de señal activa (</w:t>
+      </w:r>
+      <w:r>
+        <w:rPr>
+          <w:rFonts w:ascii="Consolas" w:hAnsi="Consolas"/>
+          <w:color w:val="0284C7"/>
+          <w:sz w:val="18"/>
+        </w:rPr>
+        <w:t>as</w:t>
+      </w:r>
+      <w:r>
+        <w:rPr>
+          <w:rFonts w:ascii="Calibri" w:hAnsi="Calibri"/>
+          <w:color w:val="1E293B"/>
+          <w:sz w:val="20"/>
+        </w:rPr>
+        <w:t>) a los 3 segundos para garantizar que Smart TVs con arranque lento de panel completen la conmutación de entrada.</w:t>
+      </w:r>
+    </w:p>
+    <w:p>
+      <w:pPr>
+        <w:spacing w:before="240" w:after="60"/>
+      </w:pPr>
+      <w:r>
+        <w:rPr>
+          <w:rFonts w:ascii="Calibri" w:hAnsi="Calibri"/>
+          <w:b/>
+          <w:color w:val="0369A1"/>
+          <w:sz w:val="24"/>
+        </w:rPr>
+        <w:t>8.2. Horarios Comerciales y Control Remoto Cloud</w:t>
       </w:r>
     </w:p>
     <w:p>
@@ -3920,7 +4274,7 @@
           <w:color w:val="1E293B"/>
           <w:sz w:val="20"/>
         </w:rPr>
-        <w:t xml:space="preserve"> Configurable por pantalla (por defecto </w:t>
+        <w:t xml:space="preserve"> Configurable por pantalla desde el Portal (por defecto </w:t>
       </w:r>
       <w:r>
         <w:rPr>
@@ -4186,6 +4540,1038 @@
         </w:rPr>
         <w:t>), activando inmediatamente el modo de reposo visual.</w:t>
       </w:r>
+    </w:p>
+    <w:p>
+      <w:pPr>
+        <w:spacing w:before="240" w:after="60"/>
+      </w:pPr>
+      <w:r>
+        <w:rPr>
+          <w:rFonts w:ascii="Calibri" w:hAnsi="Calibri"/>
+          <w:b/>
+          <w:color w:val="0369A1"/>
+          <w:sz w:val="24"/>
+        </w:rPr>
+        <w:t>8.3. Configuración Requerida por Marca de Televisor (HDMI-CEC)</w:t>
+      </w:r>
+    </w:p>
+    <w:p>
+      <w:pPr>
+        <w:spacing w:before="40" w:after="100" w:line="276" w:lineRule="auto"/>
+      </w:pPr>
+      <w:r>
+        <w:rPr>
+          <w:rFonts w:ascii="Calibri" w:hAnsi="Calibri"/>
+          <w:color w:val="1E293B"/>
+          <w:sz w:val="21"/>
+        </w:rPr>
+        <w:t>Para que el televisor reconozca las órdenes de la Raspberry Pi, debe habilitarse el protocolo CEC en su menú de ajustes:</w:t>
+      </w:r>
+    </w:p>
+    <w:tbl>
+      <w:tblPr>
+        <w:tblW w:type="auto" w:w="0"/>
+        <w:jc w:val="center"/>
+        <w:tblLook w:firstColumn="1" w:firstRow="1" w:lastColumn="0" w:lastRow="0" w:noHBand="0" w:noVBand="1" w:val="04A0"/>
+      </w:tblPr>
+      <w:tblGrid>
+        <w:gridCol w:w="3120"/>
+        <w:gridCol w:w="3120"/>
+        <w:gridCol w:w="3120"/>
+      </w:tblGrid>
+      <w:tr>
+        <w:tc>
+          <w:tcPr>
+            <w:tcW w:type="dxa" w:w="3120"/>
+            <w:shd w:fill="0E7490"/>
+            <w:tcMar>
+              <w:top w:w="140" w:type="dxa"/>
+              <w:bottom w:w="140" w:type="dxa"/>
+              <w:left w:w="140" w:type="dxa"/>
+              <w:right w:w="140" w:type="dxa"/>
+            </w:tcMar>
+          </w:tcPr>
+          <w:p>
+            <w:pPr>
+              <w:spacing w:before="60" w:after="60"/>
+              <w:jc w:val="center"/>
+            </w:pPr>
+            <w:r>
+              <w:rPr>
+                <w:rFonts w:ascii="Calibri" w:hAnsi="Calibri"/>
+                <w:b/>
+                <w:color w:val="FFFFFF"/>
+                <w:sz w:val="19"/>
+              </w:rPr>
+              <w:t>Marca</w:t>
+            </w:r>
+          </w:p>
+        </w:tc>
+        <w:tc>
+          <w:tcPr>
+            <w:tcW w:type="dxa" w:w="3120"/>
+            <w:shd w:fill="0E7490"/>
+            <w:tcMar>
+              <w:top w:w="140" w:type="dxa"/>
+              <w:bottom w:w="140" w:type="dxa"/>
+              <w:left w:w="140" w:type="dxa"/>
+              <w:right w:w="140" w:type="dxa"/>
+            </w:tcMar>
+          </w:tcPr>
+          <w:p>
+            <w:pPr>
+              <w:spacing w:before="60" w:after="60"/>
+              <w:jc w:val="center"/>
+            </w:pPr>
+            <w:r>
+              <w:rPr>
+                <w:rFonts w:ascii="Calibri" w:hAnsi="Calibri"/>
+                <w:b/>
+                <w:color w:val="FFFFFF"/>
+                <w:sz w:val="19"/>
+              </w:rPr>
+              <w:t>Nombre Comercial CEC</w:t>
+            </w:r>
+          </w:p>
+        </w:tc>
+        <w:tc>
+          <w:tcPr>
+            <w:tcW w:type="dxa" w:w="3120"/>
+            <w:shd w:fill="0E7490"/>
+            <w:tcMar>
+              <w:top w:w="140" w:type="dxa"/>
+              <w:bottom w:w="140" w:type="dxa"/>
+              <w:left w:w="140" w:type="dxa"/>
+              <w:right w:w="140" w:type="dxa"/>
+            </w:tcMar>
+          </w:tcPr>
+          <w:p>
+            <w:pPr>
+              <w:spacing w:before="60" w:after="60"/>
+              <w:jc w:val="center"/>
+            </w:pPr>
+            <w:r>
+              <w:rPr>
+                <w:rFonts w:ascii="Calibri" w:hAnsi="Calibri"/>
+                <w:b/>
+                <w:color w:val="FFFFFF"/>
+                <w:sz w:val="19"/>
+              </w:rPr>
+              <w:t>Ruta de Menú en el Televisor</w:t>
+            </w:r>
+          </w:p>
+        </w:tc>
+      </w:tr>
+      <w:tr>
+        <w:tc>
+          <w:tcPr>
+            <w:tcW w:type="dxa" w:w="3120"/>
+            <w:shd w:fill="F8FAFC"/>
+            <w:tcMar>
+              <w:top w:w="100" w:type="dxa"/>
+              <w:bottom w:w="100" w:type="dxa"/>
+              <w:left w:w="120" w:type="dxa"/>
+              <w:right w:w="120" w:type="dxa"/>
+            </w:tcMar>
+          </w:tcPr>
+          <w:p>
+            <w:pPr>
+              <w:spacing w:before="40" w:after="40"/>
+            </w:pPr>
+            <w:r>
+              <w:rPr>
+                <w:rFonts w:ascii="Calibri" w:hAnsi="Calibri"/>
+                <w:b/>
+                <w:color w:val="1E293B"/>
+                <w:sz w:val="18"/>
+              </w:rPr>
+              <w:t>Samsung</w:t>
+            </w:r>
+          </w:p>
+        </w:tc>
+        <w:tc>
+          <w:tcPr>
+            <w:tcW w:type="dxa" w:w="3120"/>
+            <w:shd w:fill="F8FAFC"/>
+            <w:tcMar>
+              <w:top w:w="100" w:type="dxa"/>
+              <w:bottom w:w="100" w:type="dxa"/>
+              <w:left w:w="120" w:type="dxa"/>
+              <w:right w:w="120" w:type="dxa"/>
+            </w:tcMar>
+          </w:tcPr>
+          <w:p>
+            <w:pPr>
+              <w:spacing w:before="40" w:after="40"/>
+            </w:pPr>
+            <w:r>
+              <w:rPr>
+                <w:rFonts w:ascii="Calibri" w:hAnsi="Calibri"/>
+                <w:b/>
+                <w:color w:val="1E293B"/>
+                <w:sz w:val="18"/>
+              </w:rPr>
+              <w:t>Anynet+ (HDMI-CEC)</w:t>
+            </w:r>
+          </w:p>
+        </w:tc>
+        <w:tc>
+          <w:tcPr>
+            <w:tcW w:type="dxa" w:w="3120"/>
+            <w:shd w:fill="F8FAFC"/>
+            <w:tcMar>
+              <w:top w:w="100" w:type="dxa"/>
+              <w:bottom w:w="100" w:type="dxa"/>
+              <w:left w:w="120" w:type="dxa"/>
+              <w:right w:w="120" w:type="dxa"/>
+            </w:tcMar>
+          </w:tcPr>
+          <w:p>
+            <w:pPr>
+              <w:spacing w:before="40" w:after="40"/>
+            </w:pPr>
+            <w:r>
+              <w:rPr>
+                <w:rFonts w:ascii="Calibri" w:hAnsi="Calibri"/>
+                <w:i/>
+                <w:color w:val="1E293B"/>
+                <w:sz w:val="18"/>
+              </w:rPr>
+              <w:t>Menú → Configuración → General → Administrador de dispositivos externos → Anynet+ (HDMI-CEC)</w:t>
+            </w:r>
+            <w:r>
+              <w:rPr>
+                <w:rFonts w:ascii="Calibri" w:hAnsi="Calibri"/>
+                <w:color w:val="1E293B"/>
+                <w:sz w:val="18"/>
+              </w:rPr>
+              <w:t xml:space="preserve">: </w:t>
+            </w:r>
+            <w:r>
+              <w:rPr>
+                <w:rFonts w:ascii="Calibri" w:hAnsi="Calibri"/>
+                <w:b/>
+                <w:color w:val="1E293B"/>
+                <w:sz w:val="18"/>
+              </w:rPr>
+              <w:t>ACTIVADO</w:t>
+            </w:r>
+            <w:r>
+              <w:rPr>
+                <w:rFonts w:ascii="Calibri" w:hAnsi="Calibri"/>
+                <w:color w:val="1E293B"/>
+                <w:sz w:val="18"/>
+              </w:rPr>
+              <w:t>.</w:t>
+            </w:r>
+          </w:p>
+        </w:tc>
+      </w:tr>
+      <w:tr>
+        <w:tc>
+          <w:tcPr>
+            <w:tcW w:type="dxa" w:w="3120"/>
+            <w:shd w:fill="FFFFFF"/>
+            <w:tcMar>
+              <w:top w:w="100" w:type="dxa"/>
+              <w:bottom w:w="100" w:type="dxa"/>
+              <w:left w:w="120" w:type="dxa"/>
+              <w:right w:w="120" w:type="dxa"/>
+            </w:tcMar>
+          </w:tcPr>
+          <w:p>
+            <w:pPr>
+              <w:spacing w:before="40" w:after="40"/>
+            </w:pPr>
+            <w:r>
+              <w:rPr>
+                <w:rFonts w:ascii="Calibri" w:hAnsi="Calibri"/>
+                <w:b/>
+                <w:color w:val="1E293B"/>
+                <w:sz w:val="18"/>
+              </w:rPr>
+              <w:t>LG</w:t>
+            </w:r>
+          </w:p>
+        </w:tc>
+        <w:tc>
+          <w:tcPr>
+            <w:tcW w:type="dxa" w:w="3120"/>
+            <w:shd w:fill="FFFFFF"/>
+            <w:tcMar>
+              <w:top w:w="100" w:type="dxa"/>
+              <w:bottom w:w="100" w:type="dxa"/>
+              <w:left w:w="120" w:type="dxa"/>
+              <w:right w:w="120" w:type="dxa"/>
+            </w:tcMar>
+          </w:tcPr>
+          <w:p>
+            <w:pPr>
+              <w:spacing w:before="40" w:after="40"/>
+            </w:pPr>
+            <w:r>
+              <w:rPr>
+                <w:rFonts w:ascii="Calibri" w:hAnsi="Calibri"/>
+                <w:b/>
+                <w:color w:val="1E293B"/>
+                <w:sz w:val="18"/>
+              </w:rPr>
+              <w:t>SIMPLINK (HDMI-CEC)</w:t>
+            </w:r>
+          </w:p>
+        </w:tc>
+        <w:tc>
+          <w:tcPr>
+            <w:tcW w:type="dxa" w:w="3120"/>
+            <w:shd w:fill="FFFFFF"/>
+            <w:tcMar>
+              <w:top w:w="100" w:type="dxa"/>
+              <w:bottom w:w="100" w:type="dxa"/>
+              <w:left w:w="120" w:type="dxa"/>
+              <w:right w:w="120" w:type="dxa"/>
+            </w:tcMar>
+          </w:tcPr>
+          <w:p>
+            <w:pPr>
+              <w:spacing w:before="40" w:after="40"/>
+            </w:pPr>
+            <w:r>
+              <w:rPr>
+                <w:rFonts w:ascii="Calibri" w:hAnsi="Calibri"/>
+                <w:i/>
+                <w:color w:val="1E293B"/>
+                <w:sz w:val="18"/>
+              </w:rPr>
+              <w:t>Ajustes → General → Dispositivos → Ajustes de HDMI → SIMPLINK (HDMI-CEC)</w:t>
+            </w:r>
+            <w:r>
+              <w:rPr>
+                <w:rFonts w:ascii="Calibri" w:hAnsi="Calibri"/>
+                <w:color w:val="1E293B"/>
+                <w:sz w:val="18"/>
+              </w:rPr>
+              <w:t xml:space="preserve">: </w:t>
+            </w:r>
+            <w:r>
+              <w:rPr>
+                <w:rFonts w:ascii="Calibri" w:hAnsi="Calibri"/>
+                <w:b/>
+                <w:color w:val="1E293B"/>
+                <w:sz w:val="18"/>
+              </w:rPr>
+              <w:t>ACTIVADO</w:t>
+            </w:r>
+            <w:r>
+              <w:rPr>
+                <w:rFonts w:ascii="Calibri" w:hAnsi="Calibri"/>
+                <w:color w:val="1E293B"/>
+                <w:sz w:val="18"/>
+              </w:rPr>
+              <w:t xml:space="preserve"> y </w:t>
+            </w:r>
+            <w:r>
+              <w:rPr>
+                <w:rFonts w:ascii="Calibri" w:hAnsi="Calibri"/>
+                <w:b/>
+                <w:color w:val="1E293B"/>
+                <w:sz w:val="18"/>
+              </w:rPr>
+              <w:t>Encendido sincronizado</w:t>
+            </w:r>
+            <w:r>
+              <w:rPr>
+                <w:rFonts w:ascii="Calibri" w:hAnsi="Calibri"/>
+                <w:color w:val="1E293B"/>
+                <w:sz w:val="18"/>
+              </w:rPr>
+              <w:t xml:space="preserve">: </w:t>
+            </w:r>
+            <w:r>
+              <w:rPr>
+                <w:rFonts w:ascii="Calibri" w:hAnsi="Calibri"/>
+                <w:b/>
+                <w:color w:val="1E293B"/>
+                <w:sz w:val="18"/>
+              </w:rPr>
+              <w:t>ACTIVADO</w:t>
+            </w:r>
+            <w:r>
+              <w:rPr>
+                <w:rFonts w:ascii="Calibri" w:hAnsi="Calibri"/>
+                <w:color w:val="1E293B"/>
+                <w:sz w:val="18"/>
+              </w:rPr>
+              <w:t>.</w:t>
+            </w:r>
+          </w:p>
+        </w:tc>
+      </w:tr>
+      <w:tr>
+        <w:tc>
+          <w:tcPr>
+            <w:tcW w:type="dxa" w:w="3120"/>
+            <w:shd w:fill="F8FAFC"/>
+            <w:tcMar>
+              <w:top w:w="100" w:type="dxa"/>
+              <w:bottom w:w="100" w:type="dxa"/>
+              <w:left w:w="120" w:type="dxa"/>
+              <w:right w:w="120" w:type="dxa"/>
+            </w:tcMar>
+          </w:tcPr>
+          <w:p>
+            <w:pPr>
+              <w:spacing w:before="40" w:after="40"/>
+            </w:pPr>
+            <w:r>
+              <w:rPr>
+                <w:rFonts w:ascii="Calibri" w:hAnsi="Calibri"/>
+                <w:b/>
+                <w:color w:val="1E293B"/>
+                <w:sz w:val="18"/>
+              </w:rPr>
+              <w:t>Sony</w:t>
+            </w:r>
+          </w:p>
+        </w:tc>
+        <w:tc>
+          <w:tcPr>
+            <w:tcW w:type="dxa" w:w="3120"/>
+            <w:shd w:fill="F8FAFC"/>
+            <w:tcMar>
+              <w:top w:w="100" w:type="dxa"/>
+              <w:bottom w:w="100" w:type="dxa"/>
+              <w:left w:w="120" w:type="dxa"/>
+              <w:right w:w="120" w:type="dxa"/>
+            </w:tcMar>
+          </w:tcPr>
+          <w:p>
+            <w:pPr>
+              <w:spacing w:before="40" w:after="40"/>
+            </w:pPr>
+            <w:r>
+              <w:rPr>
+                <w:rFonts w:ascii="Calibri" w:hAnsi="Calibri"/>
+                <w:b/>
+                <w:color w:val="1E293B"/>
+                <w:sz w:val="18"/>
+              </w:rPr>
+              <w:t>BRAVIA Sync</w:t>
+            </w:r>
+          </w:p>
+        </w:tc>
+        <w:tc>
+          <w:tcPr>
+            <w:tcW w:type="dxa" w:w="3120"/>
+            <w:shd w:fill="F8FAFC"/>
+            <w:tcMar>
+              <w:top w:w="100" w:type="dxa"/>
+              <w:bottom w:w="100" w:type="dxa"/>
+              <w:left w:w="120" w:type="dxa"/>
+              <w:right w:w="120" w:type="dxa"/>
+            </w:tcMar>
+          </w:tcPr>
+          <w:p>
+            <w:pPr>
+              <w:spacing w:before="40" w:after="40"/>
+            </w:pPr>
+            <w:r>
+              <w:rPr>
+                <w:rFonts w:ascii="Calibri" w:hAnsi="Calibri"/>
+                <w:i/>
+                <w:color w:val="1E293B"/>
+                <w:sz w:val="18"/>
+              </w:rPr>
+              <w:t>Ajustes → Canales y entradas → Entradas externas → Ajustes de BRAVIA Sync → Control de BRAVIA Sync</w:t>
+            </w:r>
+            <w:r>
+              <w:rPr>
+                <w:rFonts w:ascii="Calibri" w:hAnsi="Calibri"/>
+                <w:color w:val="1E293B"/>
+                <w:sz w:val="18"/>
+              </w:rPr>
+              <w:t xml:space="preserve">: </w:t>
+            </w:r>
+            <w:r>
+              <w:rPr>
+                <w:rFonts w:ascii="Calibri" w:hAnsi="Calibri"/>
+                <w:b/>
+                <w:color w:val="1E293B"/>
+                <w:sz w:val="18"/>
+              </w:rPr>
+              <w:t>ACTIVADO</w:t>
+            </w:r>
+            <w:r>
+              <w:rPr>
+                <w:rFonts w:ascii="Calibri" w:hAnsi="Calibri"/>
+                <w:color w:val="1E293B"/>
+                <w:sz w:val="18"/>
+              </w:rPr>
+              <w:t>.</w:t>
+            </w:r>
+          </w:p>
+        </w:tc>
+      </w:tr>
+      <w:tr>
+        <w:tc>
+          <w:tcPr>
+            <w:tcW w:type="dxa" w:w="3120"/>
+            <w:shd w:fill="FFFFFF"/>
+            <w:tcMar>
+              <w:top w:w="100" w:type="dxa"/>
+              <w:bottom w:w="100" w:type="dxa"/>
+              <w:left w:w="120" w:type="dxa"/>
+              <w:right w:w="120" w:type="dxa"/>
+            </w:tcMar>
+          </w:tcPr>
+          <w:p>
+            <w:pPr>
+              <w:spacing w:before="40" w:after="40"/>
+            </w:pPr>
+            <w:r>
+              <w:rPr>
+                <w:rFonts w:ascii="Calibri" w:hAnsi="Calibri"/>
+                <w:b/>
+                <w:color w:val="1E293B"/>
+                <w:sz w:val="18"/>
+              </w:rPr>
+              <w:t>TCL / Hisense</w:t>
+            </w:r>
+          </w:p>
+        </w:tc>
+        <w:tc>
+          <w:tcPr>
+            <w:tcW w:type="dxa" w:w="3120"/>
+            <w:shd w:fill="FFFFFF"/>
+            <w:tcMar>
+              <w:top w:w="100" w:type="dxa"/>
+              <w:bottom w:w="100" w:type="dxa"/>
+              <w:left w:w="120" w:type="dxa"/>
+              <w:right w:w="120" w:type="dxa"/>
+            </w:tcMar>
+          </w:tcPr>
+          <w:p>
+            <w:pPr>
+              <w:spacing w:before="40" w:after="40"/>
+            </w:pPr>
+            <w:r>
+              <w:rPr>
+                <w:rFonts w:ascii="Calibri" w:hAnsi="Calibri"/>
+                <w:b/>
+                <w:color w:val="1E293B"/>
+                <w:sz w:val="18"/>
+              </w:rPr>
+              <w:t>Control CEC</w:t>
+            </w:r>
+          </w:p>
+        </w:tc>
+        <w:tc>
+          <w:tcPr>
+            <w:tcW w:type="dxa" w:w="3120"/>
+            <w:shd w:fill="FFFFFF"/>
+            <w:tcMar>
+              <w:top w:w="100" w:type="dxa"/>
+              <w:bottom w:w="100" w:type="dxa"/>
+              <w:left w:w="120" w:type="dxa"/>
+              <w:right w:w="120" w:type="dxa"/>
+            </w:tcMar>
+          </w:tcPr>
+          <w:p>
+            <w:pPr>
+              <w:spacing w:before="40" w:after="40"/>
+            </w:pPr>
+            <w:r>
+              <w:rPr>
+                <w:rFonts w:ascii="Calibri" w:hAnsi="Calibri"/>
+                <w:i/>
+                <w:color w:val="1E293B"/>
+                <w:sz w:val="18"/>
+              </w:rPr>
+              <w:t>Ajustes → Sistema / Entradas → Control de CEC / HDMI y CEC</w:t>
+            </w:r>
+            <w:r>
+              <w:rPr>
+                <w:rFonts w:ascii="Calibri" w:hAnsi="Calibri"/>
+                <w:color w:val="1E293B"/>
+                <w:sz w:val="18"/>
+              </w:rPr>
+              <w:t xml:space="preserve">: </w:t>
+            </w:r>
+            <w:r>
+              <w:rPr>
+                <w:rFonts w:ascii="Calibri" w:hAnsi="Calibri"/>
+                <w:b/>
+                <w:color w:val="1E293B"/>
+                <w:sz w:val="18"/>
+              </w:rPr>
+              <w:t>ACTIVADO</w:t>
+            </w:r>
+            <w:r>
+              <w:rPr>
+                <w:rFonts w:ascii="Calibri" w:hAnsi="Calibri"/>
+                <w:color w:val="1E293B"/>
+                <w:sz w:val="18"/>
+              </w:rPr>
+              <w:t xml:space="preserve"> y </w:t>
+            </w:r>
+            <w:r>
+              <w:rPr>
+                <w:rFonts w:ascii="Calibri" w:hAnsi="Calibri"/>
+                <w:b/>
+                <w:color w:val="1E293B"/>
+                <w:sz w:val="18"/>
+              </w:rPr>
+              <w:t>Auto encendido de TV</w:t>
+            </w:r>
+            <w:r>
+              <w:rPr>
+                <w:rFonts w:ascii="Calibri" w:hAnsi="Calibri"/>
+                <w:color w:val="1E293B"/>
+                <w:sz w:val="18"/>
+              </w:rPr>
+              <w:t xml:space="preserve">: </w:t>
+            </w:r>
+            <w:r>
+              <w:rPr>
+                <w:rFonts w:ascii="Calibri" w:hAnsi="Calibri"/>
+                <w:b/>
+                <w:color w:val="1E293B"/>
+                <w:sz w:val="18"/>
+              </w:rPr>
+              <w:t>ACTIVADO</w:t>
+            </w:r>
+            <w:r>
+              <w:rPr>
+                <w:rFonts w:ascii="Calibri" w:hAnsi="Calibri"/>
+                <w:color w:val="1E293B"/>
+                <w:sz w:val="18"/>
+              </w:rPr>
+              <w:t>.</w:t>
+            </w:r>
+          </w:p>
+        </w:tc>
+      </w:tr>
+      <w:tr>
+        <w:tc>
+          <w:tcPr>
+            <w:tcW w:type="dxa" w:w="3120"/>
+            <w:shd w:fill="F8FAFC"/>
+            <w:tcMar>
+              <w:top w:w="100" w:type="dxa"/>
+              <w:bottom w:w="100" w:type="dxa"/>
+              <w:left w:w="120" w:type="dxa"/>
+              <w:right w:w="120" w:type="dxa"/>
+            </w:tcMar>
+          </w:tcPr>
+          <w:p>
+            <w:pPr>
+              <w:spacing w:before="40" w:after="40"/>
+            </w:pPr>
+            <w:r>
+              <w:rPr>
+                <w:rFonts w:ascii="Calibri" w:hAnsi="Calibri"/>
+                <w:b/>
+                <w:color w:val="1E293B"/>
+                <w:sz w:val="18"/>
+              </w:rPr>
+              <w:t>Xiaomi / Android TV</w:t>
+            </w:r>
+          </w:p>
+        </w:tc>
+        <w:tc>
+          <w:tcPr>
+            <w:tcW w:type="dxa" w:w="3120"/>
+            <w:shd w:fill="F8FAFC"/>
+            <w:tcMar>
+              <w:top w:w="100" w:type="dxa"/>
+              <w:bottom w:w="100" w:type="dxa"/>
+              <w:left w:w="120" w:type="dxa"/>
+              <w:right w:w="120" w:type="dxa"/>
+            </w:tcMar>
+          </w:tcPr>
+          <w:p>
+            <w:pPr>
+              <w:spacing w:before="40" w:after="40"/>
+            </w:pPr>
+            <w:r>
+              <w:rPr>
+                <w:rFonts w:ascii="Calibri" w:hAnsi="Calibri"/>
+                <w:b/>
+                <w:color w:val="1E293B"/>
+                <w:sz w:val="18"/>
+              </w:rPr>
+              <w:t>HDMI-CEC</w:t>
+            </w:r>
+          </w:p>
+        </w:tc>
+        <w:tc>
+          <w:tcPr>
+            <w:tcW w:type="dxa" w:w="3120"/>
+            <w:shd w:fill="F8FAFC"/>
+            <w:tcMar>
+              <w:top w:w="100" w:type="dxa"/>
+              <w:bottom w:w="100" w:type="dxa"/>
+              <w:left w:w="120" w:type="dxa"/>
+              <w:right w:w="120" w:type="dxa"/>
+            </w:tcMar>
+          </w:tcPr>
+          <w:p>
+            <w:pPr>
+              <w:spacing w:before="40" w:after="40"/>
+            </w:pPr>
+            <w:r>
+              <w:rPr>
+                <w:rFonts w:ascii="Calibri" w:hAnsi="Calibri"/>
+                <w:i/>
+                <w:color w:val="1E293B"/>
+                <w:sz w:val="18"/>
+              </w:rPr>
+              <w:t>Ajustes → Preferencias del dispositivo → Entradas → Control HDMI (CEC)</w:t>
+            </w:r>
+            <w:r>
+              <w:rPr>
+                <w:rFonts w:ascii="Calibri" w:hAnsi="Calibri"/>
+                <w:color w:val="1E293B"/>
+                <w:sz w:val="18"/>
+              </w:rPr>
+              <w:t xml:space="preserve">: </w:t>
+            </w:r>
+            <w:r>
+              <w:rPr>
+                <w:rFonts w:ascii="Calibri" w:hAnsi="Calibri"/>
+                <w:b/>
+                <w:color w:val="1E293B"/>
+                <w:sz w:val="18"/>
+              </w:rPr>
+              <w:t>ACTIVADO</w:t>
+            </w:r>
+            <w:r>
+              <w:rPr>
+                <w:rFonts w:ascii="Calibri" w:hAnsi="Calibri"/>
+                <w:color w:val="1E293B"/>
+                <w:sz w:val="18"/>
+              </w:rPr>
+              <w:t xml:space="preserve"> y </w:t>
+            </w:r>
+            <w:r>
+              <w:rPr>
+                <w:rFonts w:ascii="Calibri" w:hAnsi="Calibri"/>
+                <w:b/>
+                <w:color w:val="1E293B"/>
+                <w:sz w:val="18"/>
+              </w:rPr>
+              <w:t>TV auto power on</w:t>
+            </w:r>
+            <w:r>
+              <w:rPr>
+                <w:rFonts w:ascii="Calibri" w:hAnsi="Calibri"/>
+                <w:color w:val="1E293B"/>
+                <w:sz w:val="18"/>
+              </w:rPr>
+              <w:t xml:space="preserve">: </w:t>
+            </w:r>
+            <w:r>
+              <w:rPr>
+                <w:rFonts w:ascii="Calibri" w:hAnsi="Calibri"/>
+                <w:b/>
+                <w:color w:val="1E293B"/>
+                <w:sz w:val="18"/>
+              </w:rPr>
+              <w:t>ACTIVADO</w:t>
+            </w:r>
+            <w:r>
+              <w:rPr>
+                <w:rFonts w:ascii="Calibri" w:hAnsi="Calibri"/>
+                <w:color w:val="1E293B"/>
+                <w:sz w:val="18"/>
+              </w:rPr>
+              <w:t>.</w:t>
+            </w:r>
+          </w:p>
+        </w:tc>
+      </w:tr>
+      <w:tr>
+        <w:tc>
+          <w:tcPr>
+            <w:tcW w:type="dxa" w:w="3120"/>
+            <w:shd w:fill="FFFFFF"/>
+            <w:tcMar>
+              <w:top w:w="100" w:type="dxa"/>
+              <w:bottom w:w="100" w:type="dxa"/>
+              <w:left w:w="120" w:type="dxa"/>
+              <w:right w:w="120" w:type="dxa"/>
+            </w:tcMar>
+          </w:tcPr>
+          <w:p>
+            <w:pPr>
+              <w:spacing w:before="40" w:after="40"/>
+            </w:pPr>
+            <w:r>
+              <w:rPr>
+                <w:rFonts w:ascii="Calibri" w:hAnsi="Calibri"/>
+                <w:b/>
+                <w:color w:val="1E293B"/>
+                <w:sz w:val="18"/>
+              </w:rPr>
+              <w:t>Philips</w:t>
+            </w:r>
+          </w:p>
+        </w:tc>
+        <w:tc>
+          <w:tcPr>
+            <w:tcW w:type="dxa" w:w="3120"/>
+            <w:shd w:fill="FFFFFF"/>
+            <w:tcMar>
+              <w:top w:w="100" w:type="dxa"/>
+              <w:bottom w:w="100" w:type="dxa"/>
+              <w:left w:w="120" w:type="dxa"/>
+              <w:right w:w="120" w:type="dxa"/>
+            </w:tcMar>
+          </w:tcPr>
+          <w:p>
+            <w:pPr>
+              <w:spacing w:before="40" w:after="40"/>
+            </w:pPr>
+            <w:r>
+              <w:rPr>
+                <w:rFonts w:ascii="Calibri" w:hAnsi="Calibri"/>
+                <w:b/>
+                <w:color w:val="1E293B"/>
+                <w:sz w:val="18"/>
+              </w:rPr>
+              <w:t>EasyLink</w:t>
+            </w:r>
+          </w:p>
+        </w:tc>
+        <w:tc>
+          <w:tcPr>
+            <w:tcW w:type="dxa" w:w="3120"/>
+            <w:shd w:fill="FFFFFF"/>
+            <w:tcMar>
+              <w:top w:w="100" w:type="dxa"/>
+              <w:bottom w:w="100" w:type="dxa"/>
+              <w:left w:w="120" w:type="dxa"/>
+              <w:right w:w="120" w:type="dxa"/>
+            </w:tcMar>
+          </w:tcPr>
+          <w:p>
+            <w:pPr>
+              <w:spacing w:before="40" w:after="40"/>
+            </w:pPr>
+            <w:r>
+              <w:rPr>
+                <w:rFonts w:ascii="Calibri" w:hAnsi="Calibri"/>
+                <w:i/>
+                <w:color w:val="1E293B"/>
+                <w:sz w:val="18"/>
+              </w:rPr>
+              <w:t>Ajustes → Ajustes generales → EasyLink → EasyLink</w:t>
+            </w:r>
+            <w:r>
+              <w:rPr>
+                <w:rFonts w:ascii="Calibri" w:hAnsi="Calibri"/>
+                <w:color w:val="1E293B"/>
+                <w:sz w:val="18"/>
+              </w:rPr>
+              <w:t xml:space="preserve">: </w:t>
+            </w:r>
+            <w:r>
+              <w:rPr>
+                <w:rFonts w:ascii="Calibri" w:hAnsi="Calibri"/>
+                <w:b/>
+                <w:color w:val="1E293B"/>
+                <w:sz w:val="18"/>
+              </w:rPr>
+              <w:t>ACTIVADO</w:t>
+            </w:r>
+            <w:r>
+              <w:rPr>
+                <w:rFonts w:ascii="Calibri" w:hAnsi="Calibri"/>
+                <w:color w:val="1E293B"/>
+                <w:sz w:val="18"/>
+              </w:rPr>
+              <w:t xml:space="preserve"> y </w:t>
+            </w:r>
+            <w:r>
+              <w:rPr>
+                <w:rFonts w:ascii="Calibri" w:hAnsi="Calibri"/>
+                <w:b/>
+                <w:color w:val="1E293B"/>
+                <w:sz w:val="18"/>
+              </w:rPr>
+              <w:t>Auto encendido</w:t>
+            </w:r>
+            <w:r>
+              <w:rPr>
+                <w:rFonts w:ascii="Calibri" w:hAnsi="Calibri"/>
+                <w:color w:val="1E293B"/>
+                <w:sz w:val="18"/>
+              </w:rPr>
+              <w:t xml:space="preserve">: </w:t>
+            </w:r>
+            <w:r>
+              <w:rPr>
+                <w:rFonts w:ascii="Calibri" w:hAnsi="Calibri"/>
+                <w:b/>
+                <w:color w:val="1E293B"/>
+                <w:sz w:val="18"/>
+              </w:rPr>
+              <w:t>ACTIVADO</w:t>
+            </w:r>
+            <w:r>
+              <w:rPr>
+                <w:rFonts w:ascii="Calibri" w:hAnsi="Calibri"/>
+                <w:color w:val="1E293B"/>
+                <w:sz w:val="18"/>
+              </w:rPr>
+              <w:t>.</w:t>
+            </w:r>
+          </w:p>
+        </w:tc>
+      </w:tr>
+      <w:tr>
+        <w:tc>
+          <w:tcPr>
+            <w:tcW w:type="dxa" w:w="3120"/>
+            <w:shd w:fill="F8FAFC"/>
+            <w:tcMar>
+              <w:top w:w="100" w:type="dxa"/>
+              <w:bottom w:w="100" w:type="dxa"/>
+              <w:left w:w="120" w:type="dxa"/>
+              <w:right w:w="120" w:type="dxa"/>
+            </w:tcMar>
+          </w:tcPr>
+          <w:p>
+            <w:pPr>
+              <w:spacing w:before="40" w:after="40"/>
+            </w:pPr>
+            <w:r>
+              <w:rPr>
+                <w:rFonts w:ascii="Calibri" w:hAnsi="Calibri"/>
+                <w:b/>
+                <w:color w:val="1E293B"/>
+                <w:sz w:val="18"/>
+              </w:rPr>
+              <w:t>Panasonic</w:t>
+            </w:r>
+          </w:p>
+        </w:tc>
+        <w:tc>
+          <w:tcPr>
+            <w:tcW w:type="dxa" w:w="3120"/>
+            <w:shd w:fill="F8FAFC"/>
+            <w:tcMar>
+              <w:top w:w="100" w:type="dxa"/>
+              <w:bottom w:w="100" w:type="dxa"/>
+              <w:left w:w="120" w:type="dxa"/>
+              <w:right w:w="120" w:type="dxa"/>
+            </w:tcMar>
+          </w:tcPr>
+          <w:p>
+            <w:pPr>
+              <w:spacing w:before="40" w:after="40"/>
+            </w:pPr>
+            <w:r>
+              <w:rPr>
+                <w:rFonts w:ascii="Calibri" w:hAnsi="Calibri"/>
+                <w:b/>
+                <w:color w:val="1E293B"/>
+                <w:sz w:val="18"/>
+              </w:rPr>
+              <w:t>VIERA Link</w:t>
+            </w:r>
+          </w:p>
+        </w:tc>
+        <w:tc>
+          <w:tcPr>
+            <w:tcW w:type="dxa" w:w="3120"/>
+            <w:shd w:fill="F8FAFC"/>
+            <w:tcMar>
+              <w:top w:w="100" w:type="dxa"/>
+              <w:bottom w:w="100" w:type="dxa"/>
+              <w:left w:w="120" w:type="dxa"/>
+              <w:right w:w="120" w:type="dxa"/>
+            </w:tcMar>
+          </w:tcPr>
+          <w:p>
+            <w:pPr>
+              <w:spacing w:before="40" w:after="40"/>
+            </w:pPr>
+            <w:r>
+              <w:rPr>
+                <w:rFonts w:ascii="Calibri" w:hAnsi="Calibri"/>
+                <w:i/>
+                <w:color w:val="1E293B"/>
+                <w:sz w:val="18"/>
+              </w:rPr>
+              <w:t>Menú → Configuración → Ajustes VIERA Link → VIERA Link</w:t>
+            </w:r>
+            <w:r>
+              <w:rPr>
+                <w:rFonts w:ascii="Calibri" w:hAnsi="Calibri"/>
+                <w:color w:val="1E293B"/>
+                <w:sz w:val="18"/>
+              </w:rPr>
+              <w:t xml:space="preserve">: </w:t>
+            </w:r>
+            <w:r>
+              <w:rPr>
+                <w:rFonts w:ascii="Calibri" w:hAnsi="Calibri"/>
+                <w:b/>
+                <w:color w:val="1E293B"/>
+                <w:sz w:val="18"/>
+              </w:rPr>
+              <w:t>ACTIVADO</w:t>
+            </w:r>
+            <w:r>
+              <w:rPr>
+                <w:rFonts w:ascii="Calibri" w:hAnsi="Calibri"/>
+                <w:color w:val="1E293B"/>
+                <w:sz w:val="18"/>
+              </w:rPr>
+              <w:t xml:space="preserve"> y </w:t>
+            </w:r>
+            <w:r>
+              <w:rPr>
+                <w:rFonts w:ascii="Calibri" w:hAnsi="Calibri"/>
+                <w:b/>
+                <w:color w:val="1E293B"/>
+                <w:sz w:val="18"/>
+              </w:rPr>
+              <w:t>Encendido automático</w:t>
+            </w:r>
+            <w:r>
+              <w:rPr>
+                <w:rFonts w:ascii="Calibri" w:hAnsi="Calibri"/>
+                <w:color w:val="1E293B"/>
+                <w:sz w:val="18"/>
+              </w:rPr>
+              <w:t xml:space="preserve">: </w:t>
+            </w:r>
+            <w:r>
+              <w:rPr>
+                <w:rFonts w:ascii="Calibri" w:hAnsi="Calibri"/>
+                <w:b/>
+                <w:color w:val="1E293B"/>
+                <w:sz w:val="18"/>
+              </w:rPr>
+              <w:t>ACTIVADO</w:t>
+            </w:r>
+            <w:r>
+              <w:rPr>
+                <w:rFonts w:ascii="Calibri" w:hAnsi="Calibri"/>
+                <w:color w:val="1E293B"/>
+                <w:sz w:val="18"/>
+              </w:rPr>
+              <w:t>.</w:t>
+            </w:r>
+          </w:p>
+        </w:tc>
+      </w:tr>
+    </w:tbl>
+    <w:p>
+      <w:pPr>
+        <w:spacing w:before="0" w:after="120"/>
+      </w:pPr>
     </w:p>
     <w:p>
       <w:pPr>

</xml_diff>